<commit_message>
Stagger ODR hearings and add a staff link to the customer page.
Each uploaded customer gets the next open India time, skipping lunch, Sundays, holidays, and slots already taken. Staff can split customers across arbitrators or seat them as one panel. Owners and coordinators get an Open customer page button that does not count as a customer open.

Co-authored-by: B V Solutions <akshayrsat@users.noreply.github.com>
</commit_message>
<xml_diff>
--- a/templates/odr/Arbitral_Award_Template.docx
+++ b/templates/odr/Arbitral_Award_Template.docx
@@ -13,7 +13,7 @@
           <w:smallCaps/>
           <w:sz w:val="26"/>
         </w:rPr>
-        <w:t>Before the Sole Arbitrator</w:t>
+        <w:t>Before the {{tribunal_heading}}</w:t>
       </w:r>
     </w:p>
     <w:p>
@@ -5464,6 +5464,11 @@
             </w:pPr>
           </w:p>
           <w:p>
+            <w:r>
+              <w:t>[[REPEAT tribunal]]</w:t>
+            </w:r>
+          </w:p>
+          <w:p>
             <w:pPr>
               <w:keepNext/>
               <w:spacing w:after="40" w:before="20" w:line="252" w:lineRule="auto"/>
@@ -5501,7 +5506,7 @@
                 <w:smallCaps/>
                 <w:sz w:val="22"/>
               </w:rPr>
-              <w:t>Sole Arbitrator</w:t>
+              <w:t>{{tribunal_role}}</w:t>
             </w:r>
           </w:p>
           <w:p>
@@ -5542,6 +5547,11 @@
                 <w:sz w:val="22"/>
               </w:rPr>
               <w:t>{{arbitrator_signature_mode}}</w:t>
+            </w:r>
+          </w:p>
+          <w:p>
+            <w:r>
+              <w:t>[[END_REPEAT]]</w:t>
             </w:r>
           </w:p>
         </w:tc>

</xml_diff>